<commit_message>
lista 08 - 2026
</commit_message>
<xml_diff>
--- a/docs/antigas/Lista08-2026.docx
+++ b/docs/antigas/Lista08-2026.docx
@@ -913,21 +913,31 @@
           <w:rFonts w:ascii="Book Antiqua" w:hAnsi="Book Antiqua"/>
         </w:rPr>
         <w:tab/>
-        <w:t xml:space="preserve">Uma população consiste </w:t>
-      </w:r>
-      <w:proofErr w:type="gramStart"/>
-      <w:r>
-        <w:rPr>
-          <w:rFonts w:ascii="Book Antiqua" w:hAnsi="Book Antiqua"/>
-        </w:rPr>
-        <w:t>de</w:t>
-      </w:r>
-      <w:proofErr w:type="gramEnd"/>
-      <w:r>
-        <w:rPr>
-          <w:rFonts w:ascii="Book Antiqua" w:hAnsi="Book Antiqua"/>
-        </w:rPr>
-        <w:t xml:space="preserve"> 3 números 1, 2, 3.  Considerando-se todas as </w:t>
+        <w:t xml:space="preserve">Uma população </w:t>
+      </w:r>
+      <w:r>
+        <w:rPr>
+          <w:rFonts w:ascii="Book Antiqua" w:hAnsi="Book Antiqua"/>
+        </w:rPr>
+        <w:t xml:space="preserve">é composta pelos </w:t>
+      </w:r>
+      <w:r>
+        <w:rPr>
+          <w:rFonts w:ascii="Book Antiqua" w:hAnsi="Book Antiqua"/>
+        </w:rPr>
+        <w:t>números 1, 2, 3</w:t>
+      </w:r>
+      <w:r>
+        <w:rPr>
+          <w:rFonts w:ascii="Book Antiqua" w:hAnsi="Book Antiqua"/>
+        </w:rPr>
+        <w:t>, todos nas mesmas proporções</w:t>
+      </w:r>
+      <w:r>
+        <w:rPr>
+          <w:rFonts w:ascii="Book Antiqua" w:hAnsi="Book Antiqua"/>
+        </w:rPr>
+        <w:t xml:space="preserve">.  Considerando-se todas as </w:t>
       </w:r>
       <w:r>
         <w:rPr>
@@ -939,7 +949,19 @@
         <w:rPr>
           <w:rFonts w:ascii="Book Antiqua" w:hAnsi="Book Antiqua"/>
         </w:rPr>
-        <w:t xml:space="preserve"> de 2 elementos que podem ser retirados com reposição, determinar: </w:t>
+        <w:t xml:space="preserve"> de 2</w:t>
+      </w:r>
+      <w:r>
+        <w:rPr>
+          <w:rFonts w:ascii="Book Antiqua" w:hAnsi="Book Antiqua"/>
+        </w:rPr>
+        <w:t xml:space="preserve"> </w:t>
+      </w:r>
+      <w:r>
+        <w:rPr>
+          <w:rFonts w:ascii="Book Antiqua" w:hAnsi="Book Antiqua"/>
+        </w:rPr>
+        <w:t xml:space="preserve">elementos que podem ser retirados com reposição, determinar: </w:t>
       </w:r>
       <w:r>
         <w:rPr>
@@ -1118,19 +1140,7 @@
         <w:rPr>
           <w:rFonts w:ascii="Book Antiqua" w:hAnsi="Book Antiqua"/>
         </w:rPr>
-        <w:t>Uma empresa deseja avaliar o tempo médio de atendimento ao cliente em um de seus setores. Inicialmente, foi coletada uma amostra com 36 atendimentos para estimar a média do tempo de atendimento.</w:t>
-      </w:r>
-      <w:r>
-        <w:rPr>
-          <w:rFonts w:ascii="Book Antiqua" w:hAnsi="Book Antiqua"/>
-        </w:rPr>
-        <w:t xml:space="preserve"> </w:t>
-      </w:r>
-      <w:r>
-        <w:rPr>
-          <w:rFonts w:ascii="Book Antiqua" w:hAnsi="Book Antiqua"/>
-        </w:rPr>
-        <w:t xml:space="preserve">A gerência decidiu realizar uma nova pesquisa, desejando aumentar a precisão das estimativas. Para isso, pretende-se que o erro padrão da média do tempo de atendimento da nova amostra seja igual a </w:t>
+        <w:t xml:space="preserve">Uma empresa deseja avaliar o tempo médio de atendimento ao cliente em um de seus setores. Inicialmente, foi coletada uma amostra com 36 atendimentos para estimar a média do tempo de atendimento. A gerência decidiu realizar uma nova pesquisa, desejando aumentar a precisão das estimativas. Para isso, pretende-se que o erro padrão da média do tempo de atendimento da nova amostra seja igual a </w:t>
       </w:r>
       <m:oMath>
         <m:r>
@@ -1144,37 +1154,7 @@
         <w:rPr>
           <w:rFonts w:ascii="Book Antiqua" w:hAnsi="Book Antiqua"/>
         </w:rPr>
-        <w:t xml:space="preserve"> </w:t>
-      </w:r>
-      <w:r>
-        <w:rPr>
-          <w:rFonts w:ascii="Book Antiqua" w:hAnsi="Book Antiqua"/>
-        </w:rPr>
-        <w:t>do erro padrão obtido na primeira pesquisa.</w:t>
-      </w:r>
-      <w:r>
-        <w:rPr>
-          <w:rFonts w:ascii="Book Antiqua" w:hAnsi="Book Antiqua"/>
-        </w:rPr>
-        <w:t xml:space="preserve"> </w:t>
-      </w:r>
-      <w:r>
-        <w:rPr>
-          <w:rFonts w:ascii="Book Antiqua" w:hAnsi="Book Antiqua"/>
-        </w:rPr>
-        <w:t>Pergunta-se:</w:t>
-      </w:r>
-      <w:r>
-        <w:rPr>
-          <w:rFonts w:ascii="Book Antiqua" w:hAnsi="Book Antiqua"/>
-        </w:rPr>
-        <w:t xml:space="preserve"> </w:t>
-      </w:r>
-      <w:r>
-        <w:rPr>
-          <w:rFonts w:ascii="Book Antiqua" w:hAnsi="Book Antiqua"/>
-        </w:rPr>
-        <w:t>Qual deve ser o tamanho da nova amostra para atender a essa condição?</w:t>
+        <w:t xml:space="preserve"> do erro padrão obtido na primeira pesquisa. Pergunta-se: Qual deve ser o tamanho da nova amostra para atender a essa condição?</w:t>
       </w:r>
     </w:p>
     <w:p>
@@ -1219,19 +1199,7 @@
         <w:rPr>
           <w:rFonts w:ascii="Book Antiqua" w:hAnsi="Book Antiqua"/>
         </w:rPr>
-        <w:t>.</w:t>
-      </w:r>
-      <w:r>
-        <w:rPr>
-          <w:rFonts w:ascii="Book Antiqua" w:hAnsi="Book Antiqua"/>
-        </w:rPr>
-        <w:t xml:space="preserve"> </w:t>
-      </w:r>
-      <w:r>
-        <w:rPr>
-          <w:rFonts w:ascii="Book Antiqua" w:hAnsi="Book Antiqua"/>
-        </w:rPr>
-        <w:t xml:space="preserve">A diretoria pretende realizar uma nova pesquisa de satisfação e deseja que o erro padrão da proporção amostral de clientes satisfeitos seja igual a </w:t>
+        <w:t xml:space="preserve">. A diretoria pretende realizar uma nova pesquisa de satisfação e deseja que o erro padrão da proporção amostral de clientes satisfeitos seja igual a </w:t>
       </w:r>
       <m:oMath>
         <m:r>
@@ -1245,31 +1213,7 @@
         <w:rPr>
           <w:rFonts w:ascii="Book Antiqua" w:hAnsi="Book Antiqua"/>
         </w:rPr>
-        <w:t>.</w:t>
-      </w:r>
-      <w:r>
-        <w:rPr>
-          <w:rFonts w:ascii="Book Antiqua" w:hAnsi="Book Antiqua"/>
-        </w:rPr>
-        <w:t xml:space="preserve"> </w:t>
-      </w:r>
-      <w:r>
-        <w:rPr>
-          <w:rFonts w:ascii="Book Antiqua" w:hAnsi="Book Antiqua"/>
-        </w:rPr>
-        <w:t>Pergunta-se:</w:t>
-      </w:r>
-      <w:r>
-        <w:rPr>
-          <w:rFonts w:ascii="Book Antiqua" w:hAnsi="Book Antiqua"/>
-        </w:rPr>
-        <w:t xml:space="preserve"> </w:t>
-      </w:r>
-      <w:r>
-        <w:rPr>
-          <w:rFonts w:ascii="Book Antiqua" w:hAnsi="Book Antiqua"/>
-        </w:rPr>
-        <w:t>Qual deve ser o tamanho da amostra de clientes entrevistados para atender a essa exigência de precisão?</w:t>
+        <w:t>. Pergunta-se: Qual deve ser o tamanho da amostra de clientes entrevistados para atender a essa exigência de precisão?</w:t>
       </w:r>
     </w:p>
     <w:p>
@@ -1331,13 +1275,7 @@
         <w:rPr>
           <w:rFonts w:ascii="Book Antiqua" w:hAnsi="Book Antiqua"/>
         </w:rPr>
-        <w:t>mg/</w:t>
-      </w:r>
-      <w:r>
-        <w:rPr>
-          <w:rFonts w:ascii="Book Antiqua" w:hAnsi="Book Antiqua"/>
-        </w:rPr>
-        <w:t>dm</w:t>
+        <w:t>mg/dm</w:t>
       </w:r>
       <w:r>
         <w:rPr>
@@ -1386,28 +1324,8 @@
         <w:rPr>
           <w:rFonts w:ascii="Book Antiqua" w:hAnsi="Book Antiqua"/>
         </w:rPr>
-        <w:t xml:space="preserve">Se fossem selecionadas muitas amostras aleatórias de tamanho n=20 dessa população de áreas agrícolas, qual seria </w:t>
-      </w:r>
-      <w:r>
-        <w:rPr>
-          <w:rFonts w:ascii="Book Antiqua" w:hAnsi="Book Antiqua"/>
-        </w:rPr>
-        <w:t>o valor esperado das</w:t>
-      </w:r>
-      <w:r>
-        <w:rPr>
-          <w:rFonts w:ascii="Book Antiqua" w:hAnsi="Book Antiqua"/>
-        </w:rPr>
-        <w:t xml:space="preserve"> médias amostrais das concentrações de </w:t>
-      </w:r>
-      <w:proofErr w:type="spellStart"/>
-      <w:r>
-        <w:rPr>
-          <w:rFonts w:ascii="Book Antiqua" w:hAnsi="Book Antiqua"/>
-        </w:rPr>
-        <w:t>potássio?</w:t>
-      </w:r>
-      <w:proofErr w:type="spellEnd"/>
+        <w:t>Se fossem selecionadas muitas amostras aleatórias de tamanho n=20 dessa população de áreas agrícolas, qual seria o valor esperado das médias amostrais das concentrações de potássio?</w:t>
+      </w:r>
       <w:r>
         <w:rPr>
           <w:rFonts w:ascii="Book Antiqua" w:hAnsi="Book Antiqua"/>
@@ -1450,13 +1368,7 @@
         <w:rPr>
           <w:rFonts w:ascii="Book Antiqua" w:hAnsi="Book Antiqua"/>
         </w:rPr>
-        <w:t>mg/</w:t>
-      </w:r>
-      <w:r>
-        <w:rPr>
-          <w:rFonts w:ascii="Book Antiqua" w:hAnsi="Book Antiqua"/>
-        </w:rPr>
-        <w:t>dm</w:t>
+        <w:t>mg/dm</w:t>
       </w:r>
       <w:r>
         <w:rPr>
@@ -1494,13 +1406,7 @@
         <w:rPr>
           <w:rFonts w:ascii="Book Antiqua" w:hAnsi="Book Antiqua"/>
         </w:rPr>
-        <w:t>mg/</w:t>
-      </w:r>
-      <w:r>
-        <w:rPr>
-          <w:rFonts w:ascii="Book Antiqua" w:hAnsi="Book Antiqua"/>
-        </w:rPr>
-        <w:t>dm</w:t>
+        <w:t>mg/dm</w:t>
       </w:r>
       <w:r>
         <w:rPr>
@@ -1538,13 +1444,7 @@
         <w:rPr>
           <w:rFonts w:ascii="Book Antiqua" w:hAnsi="Book Antiqua"/>
         </w:rPr>
-        <w:t>mg/</w:t>
-      </w:r>
-      <w:r>
-        <w:rPr>
-          <w:rFonts w:ascii="Book Antiqua" w:hAnsi="Book Antiqua"/>
-        </w:rPr>
-        <w:t>dm</w:t>
+        <w:t>mg/dm</w:t>
       </w:r>
       <w:r>
         <w:rPr>
@@ -1697,20 +1597,17 @@
         <w:jc w:val="both"/>
         <w:rPr>
           <w:rFonts w:ascii="Book Antiqua" w:hAnsi="Book Antiqua"/>
-          <w:highlight w:val="yellow"/>
         </w:rPr>
       </w:pPr>
       <w:r>
         <w:rPr>
           <w:rFonts w:ascii="Book Antiqua" w:hAnsi="Book Antiqua"/>
-          <w:highlight w:val="yellow"/>
         </w:rPr>
         <w:t xml:space="preserve">07) </w:t>
       </w:r>
       <w:r>
         <w:rPr>
           <w:rFonts w:ascii="Book Antiqua" w:hAnsi="Book Antiqua"/>
-          <w:highlight w:val="yellow"/>
         </w:rPr>
         <w:tab/>
         <w:t>Uma pecuarista fornece bovinos com média de 18 arrobas e desvio padrão de 2 arrobas.  Se forem tomados lotes aleatórios de 16 animais, qual é a probabilidade que o lote tenha peso médio maior que 18,5 arrobas (mais de 296 arrobas no lote)?</w:t>
@@ -1723,98 +1620,65 @@
         <w:jc w:val="both"/>
         <w:rPr>
           <w:rFonts w:ascii="Book Antiqua" w:hAnsi="Book Antiqua"/>
-          <w:sz w:val="22"/>
-          <w:szCs w:val="22"/>
-          <w:highlight w:val="yellow"/>
         </w:rPr>
       </w:pPr>
       <w:r>
         <w:rPr>
           <w:rFonts w:ascii="Book Antiqua" w:hAnsi="Book Antiqua"/>
-          <w:sz w:val="22"/>
-          <w:szCs w:val="22"/>
-          <w:highlight w:val="yellow"/>
         </w:rPr>
         <w:t xml:space="preserve">08) </w:t>
       </w:r>
       <w:r>
         <w:rPr>
           <w:rFonts w:ascii="Book Antiqua" w:hAnsi="Book Antiqua"/>
-          <w:sz w:val="22"/>
-          <w:szCs w:val="22"/>
-          <w:highlight w:val="yellow"/>
         </w:rPr>
         <w:tab/>
       </w:r>
       <w:r>
         <w:rPr>
           <w:rFonts w:ascii="Book Antiqua" w:hAnsi="Book Antiqua"/>
-          <w:sz w:val="22"/>
-          <w:szCs w:val="22"/>
-          <w:highlight w:val="yellow"/>
         </w:rPr>
         <w:t xml:space="preserve">Em um ensaio experimental, </w:t>
       </w:r>
       <w:r>
         <w:rPr>
           <w:rFonts w:ascii="Book Antiqua" w:hAnsi="Book Antiqua"/>
-          <w:sz w:val="22"/>
-          <w:szCs w:val="22"/>
-          <w:highlight w:val="yellow"/>
         </w:rPr>
         <w:t xml:space="preserve">1000 </w:t>
       </w:r>
       <w:r>
         <w:rPr>
           <w:rFonts w:ascii="Book Antiqua" w:hAnsi="Book Antiqua"/>
-          <w:sz w:val="22"/>
-          <w:szCs w:val="22"/>
-          <w:highlight w:val="yellow"/>
         </w:rPr>
         <w:t xml:space="preserve">sementes foram plantadas, sabemos que para a espécie em questão, o índice de germinação é de </w:t>
       </w:r>
       <w:r>
         <w:rPr>
           <w:rFonts w:ascii="Book Antiqua" w:hAnsi="Book Antiqua"/>
-          <w:sz w:val="22"/>
-          <w:szCs w:val="22"/>
-          <w:highlight w:val="yellow"/>
         </w:rPr>
         <w:t xml:space="preserve">70%.  Qual é a probabilidade de se encontrar mais de 720 </w:t>
       </w:r>
       <w:r>
         <w:rPr>
           <w:rFonts w:ascii="Book Antiqua" w:hAnsi="Book Antiqua"/>
-          <w:sz w:val="22"/>
-          <w:szCs w:val="22"/>
-          <w:highlight w:val="yellow"/>
         </w:rPr>
         <w:t xml:space="preserve">plântulas </w:t>
       </w:r>
       <w:r>
         <w:rPr>
           <w:rFonts w:ascii="Book Antiqua" w:hAnsi="Book Antiqua"/>
-          <w:sz w:val="22"/>
-          <w:szCs w:val="22"/>
-          <w:highlight w:val="yellow"/>
         </w:rPr>
         <w:t>germinadas</w:t>
       </w:r>
       <w:r>
         <w:rPr>
           <w:rFonts w:ascii="Book Antiqua" w:hAnsi="Book Antiqua"/>
-          <w:sz w:val="22"/>
-          <w:szCs w:val="22"/>
-          <w:highlight w:val="yellow"/>
         </w:rPr>
         <w:t xml:space="preserve"> ensaio</w:t>
       </w:r>
       <w:r>
         <w:rPr>
           <w:rFonts w:ascii="Book Antiqua" w:hAnsi="Book Antiqua"/>
-          <w:sz w:val="22"/>
-          <w:szCs w:val="22"/>
-          <w:highlight w:val="yellow"/>
         </w:rPr>
         <w:t>?</w:t>
       </w:r>
@@ -1826,29 +1690,62 @@
         <w:jc w:val="both"/>
         <w:rPr>
           <w:rFonts w:ascii="Book Antiqua" w:hAnsi="Book Antiqua"/>
-          <w:sz w:val="22"/>
-          <w:szCs w:val="22"/>
-          <w:highlight w:val="yellow"/>
         </w:rPr>
       </w:pPr>
       <w:r>
         <w:rPr>
           <w:rFonts w:ascii="Book Antiqua" w:hAnsi="Book Antiqua"/>
-          <w:sz w:val="22"/>
-          <w:szCs w:val="22"/>
-          <w:highlight w:val="yellow"/>
         </w:rPr>
         <w:t>09)</w:t>
       </w:r>
       <w:r>
         <w:rPr>
           <w:rFonts w:ascii="Book Antiqua" w:hAnsi="Book Antiqua"/>
-          <w:sz w:val="22"/>
-          <w:szCs w:val="22"/>
-          <w:highlight w:val="yellow"/>
         </w:rPr>
         <w:tab/>
-        <w:t>Uma variável aleatória X tem distribuição normal com média 100 e desvio padrão 10.</w:t>
+        <w:t xml:space="preserve">Uma variável aleatória </w:t>
+      </w:r>
+      <m:oMath>
+        <m:r>
+          <w:rPr>
+            <w:rFonts w:ascii="Cambria Math" w:hAnsi="Cambria Math"/>
+          </w:rPr>
+          <m:t>X</m:t>
+        </m:r>
+      </m:oMath>
+      <w:r>
+        <w:rPr>
+          <w:rFonts w:ascii="Book Antiqua" w:hAnsi="Book Antiqua"/>
+        </w:rPr>
+        <w:t xml:space="preserve"> tem distribuição normal com média </w:t>
+      </w:r>
+      <m:oMath>
+        <m:r>
+          <w:rPr>
+            <w:rFonts w:ascii="Cambria Math" w:hAnsi="Cambria Math"/>
+          </w:rPr>
+          <m:t>100</m:t>
+        </m:r>
+      </m:oMath>
+      <w:r>
+        <w:rPr>
+          <w:rFonts w:ascii="Book Antiqua" w:hAnsi="Book Antiqua"/>
+        </w:rPr>
+        <w:t xml:space="preserve"> e desvio padrão </w:t>
+      </w:r>
+      <m:oMath>
+        <m:r>
+          <w:rPr>
+            <w:rFonts w:ascii="Cambria Math" w:hAnsi="Cambria Math"/>
+          </w:rPr>
+          <m:t>10</m:t>
+        </m:r>
+      </m:oMath>
+      <w:r>
+        <w:rPr>
+          <w:rFonts w:ascii="Book Antiqua" w:hAnsi="Book Antiqua"/>
+        </w:rPr>
+        <w:t>.</w:t>
       </w:r>
     </w:p>
     <w:p>
@@ -1858,70 +1755,51 @@
           <w:tab w:val="left" w:pos="851"/>
         </w:tabs>
         <w:spacing w:before="120"/>
-        <w:rPr>
-          <w:rFonts w:ascii="Book Antiqua" w:hAnsi="Book Antiqua"/>
-          <w:sz w:val="22"/>
-          <w:szCs w:val="22"/>
-          <w:highlight w:val="yellow"/>
+        <w:jc w:val="left"/>
+        <w:rPr>
+          <w:rFonts w:ascii="Book Antiqua" w:hAnsi="Book Antiqua"/>
         </w:rPr>
       </w:pPr>
       <w:r>
         <w:rPr>
           <w:rFonts w:ascii="Book Antiqua" w:hAnsi="Book Antiqua"/>
-          <w:sz w:val="22"/>
-          <w:szCs w:val="22"/>
-          <w:highlight w:val="yellow"/>
-        </w:rPr>
-        <w:t xml:space="preserve">   </w:t>
-      </w:r>
-      <w:r>
-        <w:rPr>
-          <w:rFonts w:ascii="Book Antiqua" w:hAnsi="Book Antiqua"/>
-          <w:sz w:val="22"/>
-          <w:szCs w:val="22"/>
-          <w:highlight w:val="yellow"/>
+        </w:rPr>
+        <w:t xml:space="preserve"> </w:t>
+      </w:r>
+      <w:r>
+        <w:rPr>
+          <w:rFonts w:ascii="Book Antiqua" w:hAnsi="Book Antiqua"/>
         </w:rPr>
         <w:tab/>
+      </w:r>
+      <w:r>
+        <w:rPr>
+          <w:rFonts w:ascii="Book Antiqua" w:hAnsi="Book Antiqua"/>
+        </w:rPr>
         <w:t>a)</w:t>
       </w:r>
       <w:r>
         <w:rPr>
           <w:rFonts w:ascii="Book Antiqua" w:hAnsi="Book Antiqua"/>
-          <w:sz w:val="22"/>
-          <w:szCs w:val="22"/>
-          <w:highlight w:val="yellow"/>
         </w:rPr>
         <w:tab/>
         <w:t>Qual a P(90 &lt; X &lt; 110)?</w:t>
       </w:r>
-    </w:p>
-    <w:p>
-      <w:pPr>
-        <w:spacing w:before="120"/>
-        <w:ind w:left="851" w:hanging="425"/>
-        <w:jc w:val="both"/>
-        <w:rPr>
-          <w:rFonts w:ascii="Book Antiqua" w:hAnsi="Book Antiqua"/>
-          <w:sz w:val="22"/>
-          <w:szCs w:val="22"/>
-          <w:highlight w:val="yellow"/>
-        </w:rPr>
-      </w:pPr>
-      <w:r>
-        <w:rPr>
-          <w:rFonts w:ascii="Book Antiqua" w:hAnsi="Book Antiqua"/>
-          <w:sz w:val="22"/>
-          <w:szCs w:val="22"/>
-          <w:highlight w:val="yellow"/>
+      <w:r>
+        <w:rPr>
+          <w:rFonts w:ascii="Book Antiqua" w:hAnsi="Book Antiqua"/>
+        </w:rPr>
+        <w:br/>
+      </w:r>
+      <w:r>
+        <w:rPr>
+          <w:rFonts w:ascii="Book Antiqua" w:hAnsi="Book Antiqua"/>
         </w:rPr>
         <w:t xml:space="preserve">b) </w:t>
       </w:r>
       <w:r>
         <w:rPr>
           <w:rFonts w:ascii="Book Antiqua" w:hAnsi="Book Antiqua"/>
-          <w:sz w:val="22"/>
-          <w:szCs w:val="22"/>
-          <w:highlight w:val="yellow"/>
         </w:rPr>
         <w:tab/>
         <w:t xml:space="preserve">Se </w:t>
@@ -1929,10 +1807,6 @@
       <w:r>
         <w:rPr>
           <w:rFonts w:ascii="Book Antiqua" w:hAnsi="Book Antiqua"/>
-          <w:position w:val="-4"/>
-          <w:sz w:val="22"/>
-          <w:szCs w:val="22"/>
-          <w:highlight w:val="yellow"/>
         </w:rPr>
         <w:object w:dxaOrig="220" w:dyaOrig="279" w14:anchorId="63FC2F1C">
           <v:shapetype id="_x0000_t75" coordsize="21600,21600" o:spt="75" o:preferrelative="t" path="m@4@5l@4@11@9@11@9@5xe" filled="f" stroked="f">
@@ -1954,151 +1828,61 @@
             <v:path o:extrusionok="f" gradientshapeok="t" o:connecttype="rect"/>
             <o:lock v:ext="edit" aspectratio="t"/>
           </v:shapetype>
-          <v:shape id="_x0000_i1026" type="#_x0000_t75" style="width:10.75pt;height:14.05pt" o:ole="" fillcolor="window">
+          <v:shape id="_x0000_i1025" type="#_x0000_t75" style="width:10.75pt;height:14.05pt" o:ole="" fillcolor="window">
             <v:imagedata r:id="rId5" o:title=""/>
           </v:shape>
-          <o:OLEObject Type="Embed" ProgID="Equation.3" ShapeID="_x0000_i1026" DrawAspect="Content" ObjectID="_1840118277" r:id="rId6"/>
+          <o:OLEObject Type="Embed" ProgID="Equation.3" ShapeID="_x0000_i1025" DrawAspect="Content" ObjectID="_1840191460" r:id="rId6"/>
         </w:object>
       </w:r>
       <w:r>
         <w:rPr>
           <w:rFonts w:ascii="Book Antiqua" w:hAnsi="Book Antiqua"/>
-          <w:sz w:val="22"/>
-          <w:szCs w:val="22"/>
-          <w:highlight w:val="yellow"/>
-        </w:rPr>
-        <w:t xml:space="preserve"> é a média de uma amostra de 16 elementos retirados dessa população, calcule </w:t>
-      </w:r>
-      <w:proofErr w:type="gramStart"/>
-      <w:r>
-        <w:rPr>
-          <w:rFonts w:ascii="Book Antiqua" w:hAnsi="Book Antiqua"/>
-          <w:sz w:val="22"/>
-          <w:szCs w:val="22"/>
-          <w:highlight w:val="yellow"/>
-        </w:rPr>
-        <w:t>P(</w:t>
-      </w:r>
-      <w:proofErr w:type="gramEnd"/>
-      <w:r>
-        <w:rPr>
-          <w:rFonts w:ascii="Book Antiqua" w:hAnsi="Book Antiqua"/>
-          <w:sz w:val="22"/>
-          <w:szCs w:val="22"/>
-          <w:highlight w:val="yellow"/>
-        </w:rPr>
-        <w:t>90 &lt; </w:t>
-      </w:r>
-      <w:r>
-        <w:rPr>
-          <w:rFonts w:ascii="Book Antiqua" w:hAnsi="Book Antiqua"/>
-          <w:position w:val="-4"/>
-          <w:sz w:val="22"/>
-          <w:szCs w:val="22"/>
-          <w:highlight w:val="yellow"/>
+        </w:rPr>
+        <w:t xml:space="preserve"> é a média de uma amostra de 16 elementos retirados dessa população, calcule P(90 &lt; </w:t>
+      </w:r>
+      <w:r>
+        <w:rPr>
+          <w:rFonts w:ascii="Book Antiqua" w:hAnsi="Book Antiqua"/>
         </w:rPr>
         <w:object w:dxaOrig="220" w:dyaOrig="279" w14:anchorId="5CA83CE8">
-          <v:shape id="_x0000_i1027" type="#_x0000_t75" style="width:10.75pt;height:14.05pt" o:ole="" fillcolor="window">
+          <v:shape id="_x0000_i1026" type="#_x0000_t75" style="width:10.75pt;height:14.05pt" o:ole="" fillcolor="window">
             <v:imagedata r:id="rId7" o:title=""/>
           </v:shape>
-          <o:OLEObject Type="Embed" ProgID="Equation.3" ShapeID="_x0000_i1027" DrawAspect="Content" ObjectID="_1840118278" r:id="rId8"/>
+          <o:OLEObject Type="Embed" ProgID="Equation.3" ShapeID="_x0000_i1026" DrawAspect="Content" ObjectID="_1840191461" r:id="rId8"/>
         </w:object>
       </w:r>
       <w:r>
         <w:rPr>
           <w:rFonts w:ascii="Book Antiqua" w:hAnsi="Book Antiqua"/>
-          <w:sz w:val="22"/>
-          <w:szCs w:val="22"/>
-          <w:highlight w:val="yellow"/>
         </w:rPr>
         <w:t xml:space="preserve"> &lt; 110).</w:t>
       </w:r>
-    </w:p>
-    <w:p>
-      <w:pPr>
-        <w:tabs>
-          <w:tab w:val="left" w:pos="851"/>
-        </w:tabs>
-        <w:spacing w:before="120"/>
-        <w:ind w:left="426" w:hanging="426"/>
-        <w:jc w:val="both"/>
-        <w:rPr>
-          <w:rFonts w:ascii="Book Antiqua" w:hAnsi="Book Antiqua"/>
-          <w:sz w:val="22"/>
-          <w:szCs w:val="22"/>
-          <w:highlight w:val="yellow"/>
-        </w:rPr>
-      </w:pPr>
-      <w:r>
-        <w:rPr>
-          <w:rFonts w:ascii="Book Antiqua" w:hAnsi="Book Antiqua"/>
-          <w:sz w:val="22"/>
-          <w:szCs w:val="22"/>
-          <w:highlight w:val="yellow"/>
-        </w:rPr>
-        <w:t xml:space="preserve">   </w:t>
-      </w:r>
-      <w:r>
-        <w:rPr>
-          <w:rFonts w:ascii="Book Antiqua" w:hAnsi="Book Antiqua"/>
-          <w:sz w:val="22"/>
-          <w:szCs w:val="22"/>
-          <w:highlight w:val="yellow"/>
-        </w:rPr>
-        <w:tab/>
-        <w:t xml:space="preserve">c) </w:t>
-      </w:r>
-      <w:r>
-        <w:rPr>
-          <w:rFonts w:ascii="Book Antiqua" w:hAnsi="Book Antiqua"/>
-          <w:sz w:val="22"/>
-          <w:szCs w:val="22"/>
-          <w:highlight w:val="yellow"/>
-        </w:rPr>
-        <w:tab/>
-        <w:t xml:space="preserve">Que tamanho deveria ter a amostra para que </w:t>
-      </w:r>
-      <w:proofErr w:type="gramStart"/>
-      <w:r>
-        <w:rPr>
-          <w:rFonts w:ascii="Book Antiqua" w:hAnsi="Book Antiqua"/>
-          <w:sz w:val="22"/>
-          <w:szCs w:val="22"/>
-          <w:highlight w:val="yellow"/>
-        </w:rPr>
-        <w:t>P(</w:t>
-      </w:r>
-      <w:proofErr w:type="gramEnd"/>
-      <w:r>
-        <w:rPr>
-          <w:rFonts w:ascii="Book Antiqua" w:hAnsi="Book Antiqua"/>
-          <w:sz w:val="22"/>
-          <w:szCs w:val="22"/>
-          <w:highlight w:val="yellow"/>
-        </w:rPr>
-        <w:t xml:space="preserve">90 &lt; </w:t>
-      </w:r>
-      <w:r>
-        <w:rPr>
-          <w:rFonts w:ascii="Book Antiqua" w:hAnsi="Book Antiqua"/>
-          <w:position w:val="-4"/>
-          <w:sz w:val="22"/>
-          <w:szCs w:val="22"/>
-          <w:highlight w:val="yellow"/>
+      <w:r>
+        <w:rPr>
+          <w:rFonts w:ascii="Book Antiqua" w:hAnsi="Book Antiqua"/>
+        </w:rPr>
+        <w:br/>
+      </w:r>
+      <w:r>
+        <w:rPr>
+          <w:rFonts w:ascii="Book Antiqua" w:hAnsi="Book Antiqua"/>
+        </w:rPr>
+        <w:t xml:space="preserve">c) Que tamanho deveria ter a amostra para que P(90 &lt; </w:t>
+      </w:r>
+      <w:r>
+        <w:rPr>
+          <w:rFonts w:ascii="Book Antiqua" w:hAnsi="Book Antiqua"/>
         </w:rPr>
         <w:object w:dxaOrig="220" w:dyaOrig="279" w14:anchorId="3D357FA0">
-          <v:shape id="_x0000_i1028" type="#_x0000_t75" style="width:10.75pt;height:14.05pt" o:ole="" fillcolor="window">
+          <v:shape id="_x0000_i1027" type="#_x0000_t75" style="width:10.75pt;height:14.05pt" o:ole="" fillcolor="window">
             <v:imagedata r:id="rId5" o:title=""/>
           </v:shape>
-          <o:OLEObject Type="Embed" ProgID="Equation.3" ShapeID="_x0000_i1028" DrawAspect="Content" ObjectID="_1840118279" r:id="rId9"/>
+          <o:OLEObject Type="Embed" ProgID="Equation.3" ShapeID="_x0000_i1027" DrawAspect="Content" ObjectID="_1840191462" r:id="rId9"/>
         </w:object>
       </w:r>
       <w:r>
         <w:rPr>
           <w:rFonts w:ascii="Book Antiqua" w:hAnsi="Book Antiqua"/>
-          <w:sz w:val="22"/>
-          <w:szCs w:val="22"/>
-          <w:highlight w:val="yellow"/>
         </w:rPr>
         <w:t xml:space="preserve"> &lt; 110) = 95%?</w:t>
       </w:r>
@@ -2110,99 +1894,296 @@
         <w:jc w:val="both"/>
         <w:rPr>
           <w:rFonts w:ascii="Book Antiqua" w:hAnsi="Book Antiqua"/>
-          <w:sz w:val="22"/>
-          <w:szCs w:val="22"/>
-          <w:highlight w:val="yellow"/>
         </w:rPr>
       </w:pPr>
       <w:r>
         <w:rPr>
           <w:rFonts w:ascii="Book Antiqua" w:hAnsi="Book Antiqua"/>
-          <w:sz w:val="22"/>
-          <w:szCs w:val="22"/>
-          <w:highlight w:val="yellow"/>
         </w:rPr>
         <w:t xml:space="preserve">10) </w:t>
       </w:r>
       <w:r>
         <w:rPr>
           <w:rFonts w:ascii="Book Antiqua" w:hAnsi="Book Antiqua"/>
-          <w:sz w:val="22"/>
-          <w:szCs w:val="22"/>
-          <w:highlight w:val="yellow"/>
         </w:rPr>
         <w:tab/>
-        <w:t xml:space="preserve">A capacidade máxima de uma balança é de </w:t>
-      </w:r>
-      <w:smartTag w:uri="urn:schemas-microsoft-com:office:smarttags" w:element="metricconverter">
-        <w:smartTagPr>
-          <w:attr w:name="ProductID" w:val="500 kg"/>
-        </w:smartTagPr>
-        <w:r>
+      </w:r>
+      <w:r>
+        <w:rPr>
+          <w:rFonts w:ascii="Book Antiqua" w:hAnsi="Book Antiqua"/>
+        </w:rPr>
+        <w:t>Uma empresa de logística utiliza um elevador de carga cuja capacidade máxima é de</w:t>
+      </w:r>
+      <w:r>
+        <w:rPr>
+          <w:rFonts w:ascii="Book Antiqua" w:hAnsi="Book Antiqua"/>
+        </w:rPr>
+        <w:t xml:space="preserve"> </w:t>
+      </w:r>
+      <w:r>
+        <w:rPr>
+          <w:rFonts w:ascii="Book Antiqua" w:hAnsi="Book Antiqua"/>
+        </w:rPr>
+        <w:t>500 kg</w:t>
+      </w:r>
+      <w:r>
+        <w:rPr>
+          <w:rFonts w:ascii="Book Antiqua" w:hAnsi="Book Antiqua"/>
+        </w:rPr>
+        <w:t xml:space="preserve">. </w:t>
+      </w:r>
+      <w:r>
+        <w:rPr>
+          <w:rFonts w:ascii="Book Antiqua" w:hAnsi="Book Antiqua"/>
+        </w:rPr>
+        <w:t xml:space="preserve">Os funcionários que utilizam esse elevador possuem pesos corporais com distribuição normal </w:t>
+      </w:r>
+      <m:oMath>
+        <m:r>
           <w:rPr>
-            <w:rFonts w:ascii="Book Antiqua" w:hAnsi="Book Antiqua"/>
-            <w:sz w:val="22"/>
-            <w:szCs w:val="22"/>
-            <w:highlight w:val="yellow"/>
+            <w:rFonts w:ascii="Cambria Math" w:hAnsi="Cambria Math"/>
           </w:rPr>
-          <w:t>500 kg</w:t>
-        </w:r>
-      </w:smartTag>
-      <w:r>
-        <w:rPr>
-          <w:rFonts w:ascii="Book Antiqua" w:hAnsi="Book Antiqua"/>
-          <w:sz w:val="22"/>
-          <w:szCs w:val="22"/>
-          <w:highlight w:val="yellow"/>
-        </w:rPr>
-        <w:t xml:space="preserve">.  Se a distribuição X dos pesos dos animais que serão pesados é suposta N(70, 100): a)  qual a probabilidade de 7 animais ultrapassarem esse limite? e   b) </w:t>
-      </w:r>
-      <w:r>
-        <w:rPr>
-          <w:rFonts w:ascii="Book Antiqua" w:hAnsi="Book Antiqua"/>
-          <w:sz w:val="22"/>
-          <w:szCs w:val="22"/>
-          <w:highlight w:val="yellow"/>
-        </w:rPr>
-        <w:t xml:space="preserve">qual a probabilidade de </w:t>
-      </w:r>
-      <w:r>
-        <w:rPr>
-          <w:rFonts w:ascii="Book Antiqua" w:hAnsi="Book Antiqua"/>
-          <w:sz w:val="22"/>
-          <w:szCs w:val="22"/>
-          <w:highlight w:val="yellow"/>
-        </w:rPr>
-        <w:t>6</w:t>
-      </w:r>
-      <w:r>
-        <w:rPr>
-          <w:rFonts w:ascii="Book Antiqua" w:hAnsi="Book Antiqua"/>
-          <w:sz w:val="22"/>
-          <w:szCs w:val="22"/>
-          <w:highlight w:val="yellow"/>
-        </w:rPr>
-        <w:t xml:space="preserve"> animais ultrapassarem esse limite?</w:t>
+          <m:t>X∼N</m:t>
+        </m:r>
+        <m:d>
+          <m:dPr>
+            <m:ctrlPr>
+              <w:rPr>
+                <w:rFonts w:ascii="Cambria Math" w:hAnsi="Cambria Math"/>
+                <w:i/>
+              </w:rPr>
+            </m:ctrlPr>
+          </m:dPr>
+          <m:e>
+            <m:r>
+              <w:rPr>
+                <w:rFonts w:ascii="Cambria Math" w:hAnsi="Cambria Math"/>
+              </w:rPr>
+              <m:t>70,</m:t>
+            </m:r>
+            <m:r>
+              <m:rPr>
+                <m:nor/>
+              </m:rPr>
+              <m:t> </m:t>
+            </m:r>
+            <m:r>
+              <w:rPr>
+                <w:rFonts w:ascii="Cambria Math" w:hAnsi="Cambria Math"/>
+              </w:rPr>
+              <m:t>100</m:t>
+            </m:r>
+          </m:e>
+        </m:d>
+        <m:r>
+          <w:rPr>
+            <w:rFonts w:ascii="Cambria Math" w:hAnsi="Cambria Math"/>
+          </w:rPr>
+          <m:t xml:space="preserve">, </m:t>
+        </m:r>
+      </m:oMath>
+      <w:r>
+        <w:rPr>
+          <w:rFonts w:ascii="Book Antiqua" w:hAnsi="Book Antiqua"/>
+        </w:rPr>
+        <w:t xml:space="preserve"> </w:t>
+      </w:r>
+      <w:r>
+        <w:rPr>
+          <w:rFonts w:ascii="Book Antiqua" w:hAnsi="Book Antiqua"/>
+        </w:rPr>
+        <w:t xml:space="preserve">em que a média é </w:t>
+      </w:r>
+      <m:oMath>
+        <m:r>
+          <w:rPr>
+            <w:rFonts w:ascii="Cambria Math" w:hAnsi="Cambria Math"/>
+          </w:rPr>
+          <m:t>70</m:t>
+        </m:r>
+        <m:r>
+          <m:rPr>
+            <m:nor/>
+          </m:rPr>
+          <m:t> </m:t>
+        </m:r>
+        <m:r>
+          <w:rPr>
+            <w:rFonts w:ascii="Cambria Math" w:hAnsi="Cambria Math"/>
+          </w:rPr>
+          <m:t>kg</m:t>
+        </m:r>
+      </m:oMath>
+      <w:r>
+        <w:rPr>
+          <w:rFonts w:ascii="Book Antiqua" w:hAnsi="Book Antiqua"/>
+        </w:rPr>
+        <w:t xml:space="preserve"> </w:t>
+      </w:r>
+      <w:r>
+        <w:rPr>
+          <w:rFonts w:ascii="Book Antiqua" w:hAnsi="Book Antiqua"/>
+        </w:rPr>
+        <w:t xml:space="preserve">e a variância é </w:t>
+      </w:r>
+      <m:oMath>
+        <m:r>
+          <w:rPr>
+            <w:rFonts w:ascii="Cambria Math" w:hAnsi="Cambria Math"/>
+          </w:rPr>
+          <m:t xml:space="preserve">100 </m:t>
+        </m:r>
+        <m:r>
+          <m:rPr>
+            <m:nor/>
+          </m:rPr>
+          <m:t> </m:t>
+        </m:r>
+        <m:r>
+          <w:rPr>
+            <w:rFonts w:ascii="Cambria Math" w:hAnsi="Cambria Math"/>
+          </w:rPr>
+          <m:t>k</m:t>
+        </m:r>
+        <m:sSup>
+          <m:sSupPr>
+            <m:ctrlPr>
+              <w:rPr>
+                <w:rFonts w:ascii="Cambria Math" w:hAnsi="Cambria Math"/>
+              </w:rPr>
+            </m:ctrlPr>
+          </m:sSupPr>
+          <m:e>
+            <m:r>
+              <w:rPr>
+                <w:rFonts w:ascii="Cambria Math" w:hAnsi="Cambria Math"/>
+              </w:rPr>
+              <m:t>g</m:t>
+            </m:r>
+          </m:e>
+          <m:sup>
+            <m:r>
+              <w:rPr>
+                <w:rFonts w:ascii="Cambria Math" w:hAnsi="Cambria Math"/>
+              </w:rPr>
+              <m:t>2</m:t>
+            </m:r>
+          </m:sup>
+        </m:sSup>
+      </m:oMath>
+      <w:r>
+        <w:rPr>
+          <w:rFonts w:ascii="Book Antiqua" w:hAnsi="Book Antiqua"/>
+        </w:rPr>
+        <w:t>.</w:t>
+      </w:r>
+    </w:p>
+    <w:p>
+      <w:pPr>
+        <w:spacing w:before="120"/>
+        <w:ind w:left="426" w:hanging="1"/>
+        <w:rPr>
+          <w:rFonts w:ascii="Book Antiqua" w:hAnsi="Book Antiqua"/>
+        </w:rPr>
+      </w:pPr>
+      <w:r>
+        <w:rPr>
+          <w:rFonts w:ascii="Book Antiqua" w:hAnsi="Book Antiqua"/>
+        </w:rPr>
+        <w:t>a)</w:t>
+      </w:r>
+      <w:r>
+        <w:rPr>
+          <w:rFonts w:ascii="Book Antiqua" w:hAnsi="Book Antiqua"/>
+        </w:rPr>
+        <w:t xml:space="preserve"> </w:t>
+      </w:r>
+      <w:r>
+        <w:rPr>
+          <w:rFonts w:ascii="Book Antiqua" w:hAnsi="Book Antiqua"/>
+        </w:rPr>
+        <w:t xml:space="preserve"> </w:t>
+      </w:r>
+      <w:r>
+        <w:rPr>
+          <w:rFonts w:ascii="Book Antiqua" w:hAnsi="Book Antiqua"/>
+        </w:rPr>
+        <w:t>Qual é a probabilidade de que um grupo com 7 funcionários ultrapasse o limite máximo suportado pelo elevador?</w:t>
+      </w:r>
+      <w:r>
+        <w:rPr>
+          <w:rFonts w:ascii="Book Antiqua" w:hAnsi="Book Antiqua"/>
+        </w:rPr>
+        <w:br/>
+      </w:r>
+      <w:r>
+        <w:rPr>
+          <w:rFonts w:ascii="Book Antiqua" w:hAnsi="Book Antiqua"/>
+        </w:rPr>
+        <w:t xml:space="preserve">b) </w:t>
+      </w:r>
+      <w:r>
+        <w:rPr>
+          <w:rFonts w:ascii="Book Antiqua" w:hAnsi="Book Antiqua"/>
+        </w:rPr>
+        <w:t xml:space="preserve"> </w:t>
+      </w:r>
+      <w:r>
+        <w:rPr>
+          <w:rFonts w:ascii="Book Antiqua" w:hAnsi="Book Antiqua"/>
+        </w:rPr>
+        <w:t>Qual é a probabilidade de que um grupo com 6 funcionários ultrapasse esse limite</w:t>
+      </w:r>
+      <w:r>
+        <w:rPr>
+          <w:rFonts w:ascii="Book Antiqua" w:hAnsi="Book Antiqua"/>
+        </w:rPr>
+        <w:t>?</w:t>
       </w:r>
     </w:p>
     <w:p>
       <w:pPr>
         <w:pStyle w:val="Recuodecorpodetexto"/>
-        <w:spacing w:before="120" w:after="0"/>
-        <w:rPr>
-          <w:rFonts w:ascii="Book Antiqua" w:hAnsi="Book Antiqua"/>
-          <w:sz w:val="22"/>
-          <w:szCs w:val="22"/>
+        <w:spacing w:before="120"/>
+        <w:rPr>
+          <w:rFonts w:ascii="Book Antiqua" w:hAnsi="Book Antiqua"/>
         </w:rPr>
       </w:pPr>
       <w:r>
         <w:rPr>
           <w:rFonts w:ascii="Book Antiqua" w:hAnsi="Book Antiqua"/>
-          <w:sz w:val="22"/>
-          <w:szCs w:val="22"/>
-          <w:highlight w:val="yellow"/>
-        </w:rPr>
-        <w:t>11) Um distribuidor de vacinas determina, através de testes, que 15% das vacinas não imunizam. Ele vende pacotes com 100 vacinas com garantia de 80% de imunização. Qual a probabilidade de um pacote não satisfazer a garantia?</w:t>
+        </w:rPr>
+        <w:t xml:space="preserve">11) </w:t>
+      </w:r>
+      <w:r>
+        <w:rPr>
+          <w:rFonts w:ascii="Book Antiqua" w:hAnsi="Book Antiqua"/>
+        </w:rPr>
+        <w:t>Uma empresa da área de saúde fornece kits com 100 testes rápidos para diagnóstico laboratorial e garante aos hospitais e clínicas que pelo menos 80% dos testes apresentarão funcionamento adequado.</w:t>
+      </w:r>
+      <w:r>
+        <w:rPr>
+          <w:rFonts w:ascii="Book Antiqua" w:hAnsi="Book Antiqua"/>
+        </w:rPr>
+        <w:t xml:space="preserve"> </w:t>
+      </w:r>
+      <w:r>
+        <w:rPr>
+          <w:rFonts w:ascii="Book Antiqua" w:hAnsi="Book Antiqua"/>
+        </w:rPr>
+        <w:t>Estudos de controle de qualidade indicam que 15% dos testes podem apresentar falhas de detecção ou resultados inválidos.</w:t>
+      </w:r>
+      <w:r>
+        <w:rPr>
+          <w:rFonts w:ascii="Book Antiqua" w:hAnsi="Book Antiqua"/>
+        </w:rPr>
+        <w:t xml:space="preserve"> </w:t>
+      </w:r>
+      <w:r>
+        <w:rPr>
+          <w:rFonts w:ascii="Book Antiqua" w:hAnsi="Book Antiqua"/>
+        </w:rPr>
+        <w:t>Qual é a probabilidade de um lote fornecido não atender à garantia de qualidade estabelecida pela empresa?</w:t>
       </w:r>
     </w:p>
     <w:sectPr>

</xml_diff>